<commit_message>
Add GitHub link to the deployment report
Co-Authored-By: Claude Opus 5.5 <noreply@anthropic.com>
</commit_message>
<xml_diff>
--- a/docs/TravelMemory-Deployment-Documentation.docx
+++ b/docs/TravelMemory-Deployment-Documentation.docx
@@ -187,7 +187,7 @@
           </w:tcPr>
           <w:p>
             <w:r>
-              <w:t>&lt;add your GitHub repository link here&gt;</w:t>
+              <w:t>https://github.com/ibrahimasamake/travel-memory-aws-deployment</w:t>
             </w:r>
           </w:p>
         </w:tc>
@@ -6105,7 +6105,7 @@
         <w:rPr>
           <w:b w:val="0"/>
         </w:rPr>
-        <w:t>GitHub repository (code + Terraform + this document): &lt;add your GitHub repository link here&gt;</w:t>
+        <w:t>GitHub repository (code + Terraform + this document): https://github.com/ibrahimasamake/travel-memory-aws-deployment</w:t>
       </w:r>
     </w:p>
     <w:sectPr>

</xml_diff>